<commit_message>
Labs 1 + 2 changes
</commit_message>
<xml_diff>
--- a/StudentGlossary.docx
+++ b/StudentGlossary.docx
@@ -56,7 +56,7 @@
       <w:tr>
         <w:trPr>
           <w:cnfStyle w:val="100000000000" w:firstRow="1" w:lastRow="0" w:firstColumn="0" w:lastColumn="0" w:oddVBand="0" w:evenVBand="0" w:oddHBand="0" w:evenHBand="0" w:firstRowFirstColumn="0" w:firstRowLastColumn="0" w:lastRowFirstColumn="0" w:lastRowLastColumn="0"/>
-          <w:trHeight w:val="567"/>
+          <w:trHeight w:val="850"/>
         </w:trPr>
         <w:tc>
           <w:tcPr>
@@ -114,7 +114,7 @@
       <w:tr>
         <w:trPr>
           <w:cnfStyle w:val="000000100000" w:firstRow="0" w:lastRow="0" w:firstColumn="0" w:lastColumn="0" w:oddVBand="0" w:evenVBand="0" w:oddHBand="1" w:evenHBand="0" w:firstRowFirstColumn="0" w:firstRowLastColumn="0" w:lastRowFirstColumn="0" w:lastRowLastColumn="0"/>
-          <w:trHeight w:val="567"/>
+          <w:trHeight w:val="850"/>
         </w:trPr>
         <w:tc>
           <w:tcPr>
@@ -166,7 +166,7 @@
       </w:tr>
       <w:tr>
         <w:trPr>
-          <w:trHeight w:val="567"/>
+          <w:trHeight w:val="850"/>
         </w:trPr>
         <w:tc>
           <w:tcPr>
@@ -219,7 +219,7 @@
       <w:tr>
         <w:trPr>
           <w:cnfStyle w:val="000000100000" w:firstRow="0" w:lastRow="0" w:firstColumn="0" w:lastColumn="0" w:oddVBand="0" w:evenVBand="0" w:oddHBand="1" w:evenHBand="0" w:firstRowFirstColumn="0" w:firstRowLastColumn="0" w:lastRowFirstColumn="0" w:lastRowLastColumn="0"/>
-          <w:trHeight w:val="567"/>
+          <w:trHeight w:val="850"/>
         </w:trPr>
         <w:tc>
           <w:tcPr>
@@ -271,7 +271,7 @@
       </w:tr>
       <w:tr>
         <w:trPr>
-          <w:trHeight w:val="567"/>
+          <w:trHeight w:val="850"/>
         </w:trPr>
         <w:tc>
           <w:tcPr>
@@ -324,7 +324,7 @@
       <w:tr>
         <w:trPr>
           <w:cnfStyle w:val="000000100000" w:firstRow="0" w:lastRow="0" w:firstColumn="0" w:lastColumn="0" w:oddVBand="0" w:evenVBand="0" w:oddHBand="1" w:evenHBand="0" w:firstRowFirstColumn="0" w:firstRowLastColumn="0" w:lastRowFirstColumn="0" w:lastRowLastColumn="0"/>
-          <w:trHeight w:val="567"/>
+          <w:trHeight w:val="850"/>
         </w:trPr>
         <w:tc>
           <w:tcPr>
@@ -376,7 +376,7 @@
       </w:tr>
       <w:tr>
         <w:trPr>
-          <w:trHeight w:val="567"/>
+          <w:trHeight w:val="850"/>
         </w:trPr>
         <w:tc>
           <w:tcPr>
@@ -429,7 +429,7 @@
       <w:tr>
         <w:trPr>
           <w:cnfStyle w:val="000000100000" w:firstRow="0" w:lastRow="0" w:firstColumn="0" w:lastColumn="0" w:oddVBand="0" w:evenVBand="0" w:oddHBand="1" w:evenHBand="0" w:firstRowFirstColumn="0" w:firstRowLastColumn="0" w:lastRowFirstColumn="0" w:lastRowLastColumn="0"/>
-          <w:trHeight w:val="567"/>
+          <w:trHeight w:val="850"/>
         </w:trPr>
         <w:tc>
           <w:tcPr>
@@ -481,7 +481,7 @@
       </w:tr>
       <w:tr>
         <w:trPr>
-          <w:trHeight w:val="567"/>
+          <w:trHeight w:val="850"/>
         </w:trPr>
         <w:tc>
           <w:tcPr>
@@ -534,7 +534,7 @@
       <w:tr>
         <w:trPr>
           <w:cnfStyle w:val="000000100000" w:firstRow="0" w:lastRow="0" w:firstColumn="0" w:lastColumn="0" w:oddVBand="0" w:evenVBand="0" w:oddHBand="1" w:evenHBand="0" w:firstRowFirstColumn="0" w:firstRowLastColumn="0" w:lastRowFirstColumn="0" w:lastRowLastColumn="0"/>
-          <w:trHeight w:val="567"/>
+          <w:trHeight w:val="850"/>
         </w:trPr>
         <w:tc>
           <w:tcPr>
@@ -586,7 +586,7 @@
       </w:tr>
       <w:tr>
         <w:trPr>
-          <w:trHeight w:val="567"/>
+          <w:trHeight w:val="850"/>
         </w:trPr>
         <w:tc>
           <w:tcPr>
@@ -639,7 +639,7 @@
       <w:tr>
         <w:trPr>
           <w:cnfStyle w:val="000000100000" w:firstRow="0" w:lastRow="0" w:firstColumn="0" w:lastColumn="0" w:oddVBand="0" w:evenVBand="0" w:oddHBand="1" w:evenHBand="0" w:firstRowFirstColumn="0" w:firstRowLastColumn="0" w:lastRowFirstColumn="0" w:lastRowLastColumn="0"/>
-          <w:trHeight w:val="567"/>
+          <w:trHeight w:val="850"/>
         </w:trPr>
         <w:tc>
           <w:tcPr>
@@ -691,7 +691,7 @@
       </w:tr>
       <w:tr>
         <w:trPr>
-          <w:trHeight w:val="567"/>
+          <w:trHeight w:val="850"/>
         </w:trPr>
         <w:tc>
           <w:tcPr>
@@ -744,7 +744,7 @@
       <w:tr>
         <w:trPr>
           <w:cnfStyle w:val="000000100000" w:firstRow="0" w:lastRow="0" w:firstColumn="0" w:lastColumn="0" w:oddVBand="0" w:evenVBand="0" w:oddHBand="1" w:evenHBand="0" w:firstRowFirstColumn="0" w:firstRowLastColumn="0" w:lastRowFirstColumn="0" w:lastRowLastColumn="0"/>
-          <w:trHeight w:val="567"/>
+          <w:trHeight w:val="850"/>
         </w:trPr>
         <w:tc>
           <w:tcPr>
@@ -796,7 +796,7 @@
       </w:tr>
       <w:tr>
         <w:trPr>
-          <w:trHeight w:val="567"/>
+          <w:trHeight w:val="850"/>
         </w:trPr>
         <w:tc>
           <w:tcPr>
@@ -849,7 +849,7 @@
       <w:tr>
         <w:trPr>
           <w:cnfStyle w:val="000000100000" w:firstRow="0" w:lastRow="0" w:firstColumn="0" w:lastColumn="0" w:oddVBand="0" w:evenVBand="0" w:oddHBand="1" w:evenHBand="0" w:firstRowFirstColumn="0" w:firstRowLastColumn="0" w:lastRowFirstColumn="0" w:lastRowLastColumn="0"/>
-          <w:trHeight w:val="567"/>
+          <w:trHeight w:val="850"/>
         </w:trPr>
         <w:tc>
           <w:tcPr>
@@ -877,6 +877,7 @@
                 <w:szCs w:val="22"/>
                 <w:lang w:val="en-US"/>
               </w:rPr>
+              <w:lastRenderedPageBreak/>
               <w:t>Variance inflation factor</w:t>
             </w:r>
           </w:p>
@@ -901,7 +902,7 @@
       </w:tr>
       <w:tr>
         <w:trPr>
-          <w:trHeight w:val="567"/>
+          <w:trHeight w:val="850"/>
         </w:trPr>
         <w:tc>
           <w:tcPr>
@@ -954,7 +955,7 @@
       <w:tr>
         <w:trPr>
           <w:cnfStyle w:val="000000100000" w:firstRow="0" w:lastRow="0" w:firstColumn="0" w:lastColumn="0" w:oddVBand="0" w:evenVBand="0" w:oddHBand="1" w:evenHBand="0" w:firstRowFirstColumn="0" w:firstRowLastColumn="0" w:lastRowFirstColumn="0" w:lastRowLastColumn="0"/>
-          <w:trHeight w:val="567"/>
+          <w:trHeight w:val="850"/>
         </w:trPr>
         <w:tc>
           <w:tcPr>
@@ -1001,6 +1002,9 @@
                 </m:sSupPr>
                 <m:e>
                   <m:r>
+                    <m:rPr>
+                      <m:sty m:val="bi"/>
+                    </m:rPr>
                     <w:rPr>
                       <w:rFonts w:ascii="Cambria Math" w:hAnsi="Cambria Math" w:cs="Times New Roman"/>
                       <w:sz w:val="22"/>
@@ -1012,6 +1016,9 @@
                 </m:e>
                 <m:sup>
                   <m:r>
+                    <m:rPr>
+                      <m:sty m:val="bi"/>
+                    </m:rPr>
                     <w:rPr>
                       <w:rFonts w:ascii="Cambria Math" w:hAnsi="Cambria Math" w:cs="Times New Roman"/>
                       <w:sz w:val="22"/>
@@ -1056,7 +1063,7 @@
       </w:tr>
       <w:tr>
         <w:trPr>
-          <w:trHeight w:val="567"/>
+          <w:trHeight w:val="850"/>
         </w:trPr>
         <w:tc>
           <w:tcPr>
@@ -1109,7 +1116,7 @@
       <w:tr>
         <w:trPr>
           <w:cnfStyle w:val="000000100000" w:firstRow="0" w:lastRow="0" w:firstColumn="0" w:lastColumn="0" w:oddVBand="0" w:evenVBand="0" w:oddHBand="1" w:evenHBand="0" w:firstRowFirstColumn="0" w:firstRowLastColumn="0" w:lastRowFirstColumn="0" w:lastRowLastColumn="0"/>
-          <w:trHeight w:val="567"/>
+          <w:trHeight w:val="850"/>
         </w:trPr>
         <w:tc>
           <w:tcPr>

</xml_diff>